<commit_message>
feat: folder per sale
</commit_message>
<xml_diff>
--- a/templates/HDNT.docx
+++ b/templates/HDNT.docx
@@ -221,7 +221,7 @@
           <w:sz w:val="24"/>
           <w:szCs w:val="24"/>
         </w:rPr>
-        <w:t>……..</w:t>
+        <w:t>{{so_hd}}</w:t>
       </w:r>
       <w:r>
         <w:rPr>
@@ -265,7 +265,40 @@
           <w:sz w:val="24"/>
           <w:szCs w:val="24"/>
         </w:rPr>
-        <w:t xml:space="preserve">……- </w:t>
+        <w:t>{{ten_</w:t>
+      </w:r>
+      <w:r>
+        <w:rPr>
+          <w:rFonts w:ascii="Times New Roman" w:hAnsi="Times New Roman" w:cs="Times New Roman"/>
+          <w:b/>
+          <w:bCs/>
+          <w:color w:val="FF0000"/>
+          <w:sz w:val="24"/>
+          <w:szCs w:val="24"/>
+        </w:rPr>
+        <w:t>hd</w:t>
+      </w:r>
+      <w:r>
+        <w:rPr>
+          <w:rFonts w:ascii="Times New Roman" w:hAnsi="Times New Roman" w:cs="Times New Roman"/>
+          <w:b/>
+          <w:bCs/>
+          <w:color w:val="FF0000"/>
+          <w:sz w:val="24"/>
+          <w:szCs w:val="24"/>
+        </w:rPr>
+        <w:t>}}</w:t>
+      </w:r>
+      <w:r>
+        <w:rPr>
+          <w:rFonts w:ascii="Times New Roman" w:hAnsi="Times New Roman" w:cs="Times New Roman"/>
+          <w:b/>
+          <w:bCs/>
+          <w:color w:val="FF0000"/>
+          <w:sz w:val="24"/>
+          <w:szCs w:val="24"/>
+        </w:rPr>
+        <w:t xml:space="preserve">- </w:t>
       </w:r>
       <w:r>
         <w:rPr>
@@ -605,7 +638,7 @@
           <w:szCs w:val="24"/>
           <w:lang w:val="nl-NL"/>
         </w:rPr>
-        <w:t>{{thoi_gian_tao}}</w:t>
+        <w:t>26 tháng 01 năm 2026</w:t>
       </w:r>
       <w:r>
         <w:rPr>
@@ -822,7 +855,27 @@
           <w:szCs w:val="24"/>
           <w:lang w:val="nl-NL"/>
         </w:rPr>
-        <w:t>: {{so_tai_khoan}}</w:t>
+        <w:t>: {{so_tai_khoan</w:t>
+      </w:r>
+      <w:r>
+        <w:rPr>
+          <w:rFonts w:ascii="Times New Roman" w:hAnsi="Times New Roman" w:cs="Times New Roman"/>
+          <w:color w:val="000000"/>
+          <w:sz w:val="24"/>
+          <w:szCs w:val="24"/>
+          <w:lang w:val="nl-NL"/>
+        </w:rPr>
+        <w:t>_ngan_hang</w:t>
+      </w:r>
+      <w:r>
+        <w:rPr>
+          <w:rFonts w:ascii="Times New Roman" w:hAnsi="Times New Roman" w:cs="Times New Roman"/>
+          <w:color w:val="000000"/>
+          <w:sz w:val="24"/>
+          <w:szCs w:val="24"/>
+          <w:lang w:val="nl-NL"/>
+        </w:rPr>
+        <w:t>}}</w:t>
       </w:r>
     </w:p>
     <w:p>
@@ -3621,8 +3674,8 @@
       <w:tblLook w:val="04A0" w:firstRow="1" w:lastRow="0" w:firstColumn="1" w:lastColumn="0" w:noHBand="0" w:noVBand="1"/>
     </w:tblPr>
     <w:tblGrid>
-      <w:gridCol w:w="3798"/>
-      <w:gridCol w:w="6388"/>
+      <w:gridCol w:w="3796"/>
+      <w:gridCol w:w="6390"/>
     </w:tblGrid>
     <w:tr>
       <w:trPr>
@@ -3655,7 +3708,7 @@
               <w:sz w:val="24"/>
               <w:szCs w:val="24"/>
             </w:rPr>
-            <w:pict>
+            <w:pict w14:anchorId="52EBAF32">
               <v:shapetype id="_x0000_t75" coordsize="21600,21600" o:spt="75" o:preferrelative="t" path="m@4@5l@4@11@9@11@9@5xe" filled="f" stroked="f">
                 <v:stroke joinstyle="miter"/>
                 <v:formulas>
@@ -3675,7 +3728,7 @@
                 <v:path o:extrusionok="f" gradientshapeok="t" o:connecttype="rect"/>
                 <o:lock v:ext="edit" aspectratio="t"/>
               </v:shapetype>
-              <v:shape id="_x0000_i1025" type="#_x0000_t75" alt="Thiết kế chưa có tên (6)" style="width:179.25pt;height:57pt">
+              <v:shape id="_x0000_i1025" type="#_x0000_t75" alt="Thiết kế chưa có tên (6)" style="width:179.25pt;height:57pt;mso-width-percent:0;mso-height-percent:0;mso-width-percent:0;mso-height-percent:0">
                 <v:imagedata r:id="rId1" o:title="Thiết kế chưa có tên (6)"/>
               </v:shape>
             </w:pict>
@@ -5987,6 +6040,50 @@
     <w:lsdException w:name="Subtitle" w:qFormat="1"/>
     <w:lsdException w:name="Strong" w:qFormat="1"/>
     <w:lsdException w:name="Emphasis" w:qFormat="1"/>
+    <w:lsdException w:name="Normal Table" w:semiHidden="1" w:unhideWhenUsed="1"/>
+    <w:lsdException w:name="Table Simple 1" w:semiHidden="1" w:unhideWhenUsed="1"/>
+    <w:lsdException w:name="Table Simple 2" w:semiHidden="1" w:unhideWhenUsed="1"/>
+    <w:lsdException w:name="Table Simple 3" w:semiHidden="1" w:unhideWhenUsed="1"/>
+    <w:lsdException w:name="Table Classic 1" w:semiHidden="1" w:unhideWhenUsed="1"/>
+    <w:lsdException w:name="Table Classic 2" w:semiHidden="1" w:unhideWhenUsed="1"/>
+    <w:lsdException w:name="Table Classic 3" w:semiHidden="1" w:unhideWhenUsed="1"/>
+    <w:lsdException w:name="Table Classic 4" w:semiHidden="1" w:unhideWhenUsed="1"/>
+    <w:lsdException w:name="Table Colorful 1" w:semiHidden="1" w:unhideWhenUsed="1"/>
+    <w:lsdException w:name="Table Colorful 2" w:semiHidden="1" w:unhideWhenUsed="1"/>
+    <w:lsdException w:name="Table Colorful 3" w:semiHidden="1" w:unhideWhenUsed="1"/>
+    <w:lsdException w:name="Table Columns 1" w:semiHidden="1" w:unhideWhenUsed="1"/>
+    <w:lsdException w:name="Table Columns 2" w:semiHidden="1" w:unhideWhenUsed="1"/>
+    <w:lsdException w:name="Table Columns 3" w:semiHidden="1" w:unhideWhenUsed="1"/>
+    <w:lsdException w:name="Table Columns 4" w:semiHidden="1" w:unhideWhenUsed="1"/>
+    <w:lsdException w:name="Table Columns 5" w:semiHidden="1" w:unhideWhenUsed="1"/>
+    <w:lsdException w:name="Table Grid 1" w:semiHidden="1" w:unhideWhenUsed="1"/>
+    <w:lsdException w:name="Table Grid 2" w:semiHidden="1" w:unhideWhenUsed="1"/>
+    <w:lsdException w:name="Table Grid 3" w:semiHidden="1" w:unhideWhenUsed="1"/>
+    <w:lsdException w:name="Table Grid 4" w:semiHidden="1" w:unhideWhenUsed="1"/>
+    <w:lsdException w:name="Table Grid 5" w:semiHidden="1" w:unhideWhenUsed="1"/>
+    <w:lsdException w:name="Table Grid 6" w:semiHidden="1" w:unhideWhenUsed="1"/>
+    <w:lsdException w:name="Table Grid 7" w:semiHidden="1" w:unhideWhenUsed="1"/>
+    <w:lsdException w:name="Table Grid 8" w:semiHidden="1" w:unhideWhenUsed="1"/>
+    <w:lsdException w:name="Table List 1" w:semiHidden="1" w:unhideWhenUsed="1"/>
+    <w:lsdException w:name="Table List 2" w:semiHidden="1" w:unhideWhenUsed="1"/>
+    <w:lsdException w:name="Table List 3" w:semiHidden="1" w:unhideWhenUsed="1"/>
+    <w:lsdException w:name="Table List 4" w:semiHidden="1" w:unhideWhenUsed="1"/>
+    <w:lsdException w:name="Table List 5" w:semiHidden="1" w:unhideWhenUsed="1"/>
+    <w:lsdException w:name="Table List 6" w:semiHidden="1" w:unhideWhenUsed="1"/>
+    <w:lsdException w:name="Table List 7" w:semiHidden="1" w:unhideWhenUsed="1"/>
+    <w:lsdException w:name="Table List 8" w:semiHidden="1" w:unhideWhenUsed="1"/>
+    <w:lsdException w:name="Table 3D effects 1" w:semiHidden="1" w:unhideWhenUsed="1"/>
+    <w:lsdException w:name="Table 3D effects 2" w:semiHidden="1" w:unhideWhenUsed="1"/>
+    <w:lsdException w:name="Table 3D effects 3" w:semiHidden="1" w:unhideWhenUsed="1"/>
+    <w:lsdException w:name="Table Contemporary" w:semiHidden="1" w:unhideWhenUsed="1"/>
+    <w:lsdException w:name="Table Elegant" w:semiHidden="1" w:unhideWhenUsed="1"/>
+    <w:lsdException w:name="Table Professional" w:semiHidden="1" w:unhideWhenUsed="1"/>
+    <w:lsdException w:name="Table Subtle 1" w:semiHidden="1" w:unhideWhenUsed="1"/>
+    <w:lsdException w:name="Table Subtle 2" w:semiHidden="1" w:unhideWhenUsed="1"/>
+    <w:lsdException w:name="Table Web 1" w:semiHidden="1" w:unhideWhenUsed="1"/>
+    <w:lsdException w:name="Table Web 2" w:semiHidden="1" w:unhideWhenUsed="1"/>
+    <w:lsdException w:name="Table Web 3" w:semiHidden="1" w:unhideWhenUsed="1"/>
+    <w:lsdException w:name="Table Theme" w:semiHidden="1" w:unhideWhenUsed="1"/>
     <w:lsdException w:name="Placeholder Text" w:semiHidden="1" w:uiPriority="99"/>
     <w:lsdException w:name="No Spacing" w:uiPriority="1" w:qFormat="1"/>
     <w:lsdException w:name="Light Shading" w:uiPriority="60"/>
@@ -6220,11 +6317,15 @@
   </w:style>
   <w:style w:type="character" w:default="1" w:styleId="DefaultParagraphFont">
     <w:name w:val="Default Paragraph Font"/>
+    <w:uiPriority w:val="1"/>
     <w:semiHidden/>
+    <w:unhideWhenUsed/>
   </w:style>
   <w:style w:type="table" w:default="1" w:styleId="TableNormal">
     <w:name w:val="Normal Table"/>
+    <w:uiPriority w:val="99"/>
     <w:semiHidden/>
+    <w:unhideWhenUsed/>
     <w:tblPr>
       <w:tblInd w:w="0" w:type="dxa"/>
       <w:tblCellMar>
@@ -6237,7 +6338,9 @@
   </w:style>
   <w:style w:type="numbering" w:default="1" w:styleId="NoList">
     <w:name w:val="No List"/>
+    <w:uiPriority w:val="99"/>
     <w:semiHidden/>
+    <w:unhideWhenUsed/>
   </w:style>
   <w:style w:type="paragraph" w:styleId="BodyTextIndent3">
     <w:name w:val="Body Text Indent 3"/>

</xml_diff>